<commit_message>
create en and fr reference
</commit_message>
<xml_diff>
--- a/assets/gabarit.docx
+++ b/assets/gabarit.docx
@@ -436,7 +436,7 @@
                                   </w:rPr>
                                 </w:pPr>
                                 <w:r>
-                                  <w:t xml:space="preserve">{{SALLE}}</w:t>
+                                  <w:t xml:space="preserve">{{ROOM}}</w:t>
                                 </w:r>
                               </w:p>
                             </w:txbxContent>
@@ -472,7 +472,7 @@
                             </w:rPr>
                           </w:pPr>
                           <w:r>
-                            <w:t xml:space="preserve">{{SALLE}}</w:t>
+                            <w:t xml:space="preserve">{{ROOM}}</w:t>
                           </w:r>
                         </w:p>
                       </w:txbxContent>
@@ -2215,7 +2215,7 @@
             <w:rPr>
               <w:lang w:val="fr-CA"/>
             </w:rPr>
-            <w:t>Contenus</w:t>
+            <w:t>{{TOC_TITLE}}</w:t>
             <w:tab/>
           </w:r>
         </w:p>
@@ -2233,7 +2233,7 @@
             <w:fldChar w:fldCharType="separate"/>
           </w:r>
           <w:r>
-            <w:t>Mettre à jour la table des matières (clic droit, Mettre à jour les champs).</w:t>
+            <w:t>{{TOC_HINT}}</w:t>
           </w:r>
           <w:r>
             <w:fldChar w:fldCharType="end"/>
@@ -2440,7 +2440,7 @@
     </w:p>
     <w:p>
       <w:r>
-        <w:t>{{CORPS}}</w:t>
+        <w:t>{{BODY}}</w:t>
       </w:r>
     </w:p>
     <w:sectPr>
@@ -3393,7 +3393,7 @@
             <w:sz w:val="28"/>
             <w:szCs w:val="28"/>
           </w:rPr>
-          <w:t>{{CLIENT}} - {{SALLE}}</w:t>
+          <w:t>{{CLIENT}} - {{ROOM}}</w:t>
         </w:r>
       </w:sdtContent>
     </w:sdt>
@@ -3475,7 +3475,7 @@
         <w:color w:val="808080" w:themeColor="background1" w:themeShade="80"/>
         <w:sz w:val="24"/>
       </w:rPr>
-      <w:t>{{CLIENT}} – {{TYPE_DE_SALLE}}</w:t>
+      <w:t>{{CLIENT}} – {{ROOM_TYPE}}</w:t>
     </w:r>
     <w:r>
       <w:rPr>
@@ -3587,7 +3587,7 @@
           <w:rPr>
             <w:color w:val="2A357B" w:themeColor="text2"/>
           </w:rPr>
-          <w:t>{{CLIENT}} - {{SALLE}}</w:t>
+          <w:t>{{CLIENT}} - {{ROOM}}</w:t>
         </w:r>
       </w:sdtContent>
     </w:sdt>

</xml_diff>